<commit_message>
Task B for Susmita
</commit_message>
<xml_diff>
--- a/Assignment1TaskA.docx
+++ b/Assignment1TaskA.docx
@@ -1,13 +1,8 @@
 
 <file path=word/document.xml><?xml version="1.0" encoding="utf-8"?>
-<w:document xmlns:wpc="http://schemas.microsoft.com/office/word/2010/wordprocessingCanvas" xmlns:cx="http://schemas.microsoft.com/office/drawing/2014/chartex" xmlns:cx1="http://schemas.microsoft.com/office/drawing/2015/9/8/chartex" xmlns:mc="http://schemas.openxmlformats.org/markup-compatibility/2006" xmlns:o="urn:schemas-microsoft-com:office:office" xmlns:r="http://schemas.openxmlformats.org/officeDocument/2006/relationships" xmlns:m="http://schemas.openxmlformats.org/officeDocument/2006/math" xmlns:v="urn:schemas-microsoft-com:vml" xmlns:wp14="http://schemas.microsoft.com/office/word/2010/wordprocessingDrawing" xmlns:wp="http://schemas.openxmlformats.org/drawingml/2006/wordprocessingDrawing" xmlns:w10="urn:schemas-microsoft-com:office:word" xmlns:w="http://schemas.openxmlformats.org/wordprocessingml/2006/main" xmlns:w14="http://schemas.microsoft.com/office/word/2010/wordml" xmlns:w15="http://schemas.microsoft.com/office/word/2012/wordml" xmlns:w16se="http://schemas.microsoft.com/office/word/2015/wordml/symex" xmlns:wpg="http://schemas.microsoft.com/office/word/2010/wordprocessingGroup" xmlns:wpi="http://schemas.microsoft.com/office/word/2010/wordprocessingInk" xmlns:wne="http://schemas.microsoft.com/office/word/2006/wordml" xmlns:wps="http://schemas.microsoft.com/office/word/2010/wordprocessingShape" mc:Ignorable="w14 w15 w16se wp14">
+<w:document xmlns:wpc="http://schemas.microsoft.com/office/word/2010/wordprocessingCanvas" xmlns:cx="http://schemas.microsoft.com/office/drawing/2014/chartex" xmlns:cx1="http://schemas.microsoft.com/office/drawing/2015/9/8/chartex" xmlns:cx2="http://schemas.microsoft.com/office/drawing/2015/10/21/chartex" xmlns:cx3="http://schemas.microsoft.com/office/drawing/2016/5/9/chartex" xmlns:cx4="http://schemas.microsoft.com/office/drawing/2016/5/10/chartex" xmlns:cx5="http://schemas.microsoft.com/office/drawing/2016/5/11/chartex" xmlns:cx6="http://schemas.microsoft.com/office/drawing/2016/5/12/chartex" xmlns:cx7="http://schemas.microsoft.com/office/drawing/2016/5/13/chartex" xmlns:cx8="http://schemas.microsoft.com/office/drawing/2016/5/14/chartex" xmlns:mc="http://schemas.openxmlformats.org/markup-compatibility/2006" xmlns:aink="http://schemas.microsoft.com/office/drawing/2016/ink" xmlns:am3d="http://schemas.microsoft.com/office/drawing/2017/model3d" xmlns:o="urn:schemas-microsoft-com:office:office" xmlns:oel="http://schemas.microsoft.com/office/2019/extlst" xmlns:r="http://schemas.openxmlformats.org/officeDocument/2006/relationships" xmlns:m="http://schemas.openxmlformats.org/officeDocument/2006/math" xmlns:v="urn:schemas-microsoft-com:vml" xmlns:wp14="http://schemas.microsoft.com/office/word/2010/wordprocessingDrawing" xmlns:wp="http://schemas.openxmlformats.org/drawingml/2006/wordprocessingDrawing" xmlns:w10="urn:schemas-microsoft-com:office:word" xmlns:w="http://schemas.openxmlformats.org/wordprocessingml/2006/main" xmlns:w14="http://schemas.microsoft.com/office/word/2010/wordml" xmlns:w15="http://schemas.microsoft.com/office/word/2012/wordml" xmlns:w16cex="http://schemas.microsoft.com/office/word/2018/wordml/cex" xmlns:w16cid="http://schemas.microsoft.com/office/word/2016/wordml/cid" xmlns:w16="http://schemas.microsoft.com/office/word/2018/wordml" xmlns:w16du="http://schemas.microsoft.com/office/word/2023/wordml/word16du" xmlns:w16sdtdh="http://schemas.microsoft.com/office/word/2020/wordml/sdtdatahash" xmlns:w16sdtfl="http://schemas.microsoft.com/office/word/2024/wordml/sdtformatlock" xmlns:w16se="http://schemas.microsoft.com/office/word/2015/wordml/symex" xmlns:wpg="http://schemas.microsoft.com/office/word/2010/wordprocessingGroup" xmlns:wpi="http://schemas.microsoft.com/office/word/2010/wordprocessingInk" xmlns:wne="http://schemas.microsoft.com/office/word/2006/wordml" xmlns:wps="http://schemas.microsoft.com/office/word/2010/wordprocessingShape" mc:Ignorable="w14 w15 w16se w16cid w16 w16cex w16sdtdh w16sdtfl w16du wp14">
   <w:body>
     <w:p>
-      <w:r>
-        <w:t xml:space="preserve"> </w:t>
-      </w:r>
-      <w:bookmarkStart w:id="0" w:name="_GoBack"/>
-      <w:bookmarkEnd w:id="0"/>
       <w:r>
         <w:t>Overview</w:t>
       </w:r>
@@ -17,15 +12,7 @@
         <w:jc w:val="both"/>
       </w:pPr>
       <w:r>
-        <w:t xml:space="preserve">In our assignment, we need to make a full stack application named </w:t>
-      </w:r>
-      <w:proofErr w:type="spellStart"/>
-      <w:r>
-        <w:t>SavePlate</w:t>
-      </w:r>
-      <w:proofErr w:type="spellEnd"/>
-      <w:r>
-        <w:t xml:space="preserve"> which is a smart food reduction application. It helps the people of Malaysia to manage their food and control wastage. Our application is a web based which is made to solve the problem of food wastage created by the excess food consumed by the people. This is done by allowing users of our web app to track their food intake, provide notification as per their choice about the tasks that they need to do and also reminders to track the expiry date of foods, planning of the meal and many other features. </w:t>
+        <w:t xml:space="preserve">In our assignment, we need to make a full stack application named SavePlate which is a smart food reduction application. It helps the people of Malaysia to manage their food and control wastage. Our application is a web based which is made to solve the problem of food wastage created by the excess food consumed by the people. This is done by allowing users of our web app to track their food intake, provide notification as per their choice about the tasks that they need to do and also reminders to track the expiry date of foods, planning of the meal and many other features. </w:t>
       </w:r>
     </w:p>
     <w:p>
@@ -72,13 +59,8 @@
       <w:pPr>
         <w:jc w:val="both"/>
       </w:pPr>
-      <w:proofErr w:type="spellStart"/>
       <w:r>
-        <w:t>SavePlate</w:t>
-      </w:r>
-      <w:proofErr w:type="spellEnd"/>
-      <w:r>
-        <w:t xml:space="preserve"> is a web based application that offers the users of our application the following:</w:t>
+        <w:t>SavePlate is a web based application that offers the users of our application the following:</w:t>
       </w:r>
     </w:p>
     <w:p>
@@ -151,13 +133,8 @@
       <w:pPr>
         <w:jc w:val="both"/>
       </w:pPr>
-      <w:proofErr w:type="spellStart"/>
       <w:r>
-        <w:t>SavePlate</w:t>
-      </w:r>
-      <w:proofErr w:type="spellEnd"/>
-      <w:r>
-        <w:t xml:space="preserve"> is a web based application that is </w:t>
+        <w:t xml:space="preserve">SavePlate is a web based application that is </w:t>
       </w:r>
       <w:r>
         <w:t>accessible</w:t>
@@ -250,6 +227,14 @@
       <w:pPr>
         <w:jc w:val="both"/>
       </w:pPr>
+      <w:r>
+        <w:t>This task is for me “Susmita Shrestha-e2300584”.</w:t>
+      </w:r>
+    </w:p>
+    <w:p>
+      <w:pPr>
+        <w:jc w:val="both"/>
+      </w:pPr>
     </w:p>
     <w:sectPr>
       <w:pgSz w:w="12240" w:h="15840"/>
@@ -262,7 +247,7 @@
 </file>
 
 <file path=word/numbering.xml><?xml version="1.0" encoding="utf-8"?>
-<w:numbering xmlns:wpc="http://schemas.microsoft.com/office/word/2010/wordprocessingCanvas" xmlns:cx="http://schemas.microsoft.com/office/drawing/2014/chartex" xmlns:cx1="http://schemas.microsoft.com/office/drawing/2015/9/8/chartex" xmlns:mc="http://schemas.openxmlformats.org/markup-compatibility/2006" xmlns:o="urn:schemas-microsoft-com:office:office" xmlns:r="http://schemas.openxmlformats.org/officeDocument/2006/relationships" xmlns:m="http://schemas.openxmlformats.org/officeDocument/2006/math" xmlns:v="urn:schemas-microsoft-com:vml" xmlns:wp14="http://schemas.microsoft.com/office/word/2010/wordprocessingDrawing" xmlns:wp="http://schemas.openxmlformats.org/drawingml/2006/wordprocessingDrawing" xmlns:w10="urn:schemas-microsoft-com:office:word" xmlns:w="http://schemas.openxmlformats.org/wordprocessingml/2006/main" xmlns:w14="http://schemas.microsoft.com/office/word/2010/wordml" xmlns:w15="http://schemas.microsoft.com/office/word/2012/wordml" xmlns:w16se="http://schemas.microsoft.com/office/word/2015/wordml/symex" xmlns:wpg="http://schemas.microsoft.com/office/word/2010/wordprocessingGroup" xmlns:wpi="http://schemas.microsoft.com/office/word/2010/wordprocessingInk" xmlns:wne="http://schemas.microsoft.com/office/word/2006/wordml" xmlns:wps="http://schemas.microsoft.com/office/word/2010/wordprocessingShape" mc:Ignorable="w14 w15 w16se wp14">
+<w:numbering xmlns:wpc="http://schemas.microsoft.com/office/word/2010/wordprocessingCanvas" xmlns:cx="http://schemas.microsoft.com/office/drawing/2014/chartex" xmlns:cx1="http://schemas.microsoft.com/office/drawing/2015/9/8/chartex" xmlns:cx2="http://schemas.microsoft.com/office/drawing/2015/10/21/chartex" xmlns:cx3="http://schemas.microsoft.com/office/drawing/2016/5/9/chartex" xmlns:cx4="http://schemas.microsoft.com/office/drawing/2016/5/10/chartex" xmlns:cx5="http://schemas.microsoft.com/office/drawing/2016/5/11/chartex" xmlns:cx6="http://schemas.microsoft.com/office/drawing/2016/5/12/chartex" xmlns:cx7="http://schemas.microsoft.com/office/drawing/2016/5/13/chartex" xmlns:cx8="http://schemas.microsoft.com/office/drawing/2016/5/14/chartex" xmlns:mc="http://schemas.openxmlformats.org/markup-compatibility/2006" xmlns:aink="http://schemas.microsoft.com/office/drawing/2016/ink" xmlns:am3d="http://schemas.microsoft.com/office/drawing/2017/model3d" xmlns:o="urn:schemas-microsoft-com:office:office" xmlns:oel="http://schemas.microsoft.com/office/2019/extlst" xmlns:r="http://schemas.openxmlformats.org/officeDocument/2006/relationships" xmlns:m="http://schemas.openxmlformats.org/officeDocument/2006/math" xmlns:v="urn:schemas-microsoft-com:vml" xmlns:wp14="http://schemas.microsoft.com/office/word/2010/wordprocessingDrawing" xmlns:wp="http://schemas.openxmlformats.org/drawingml/2006/wordprocessingDrawing" xmlns:w10="urn:schemas-microsoft-com:office:word" xmlns:w="http://schemas.openxmlformats.org/wordprocessingml/2006/main" xmlns:w14="http://schemas.microsoft.com/office/word/2010/wordml" xmlns:w15="http://schemas.microsoft.com/office/word/2012/wordml" xmlns:w16cex="http://schemas.microsoft.com/office/word/2018/wordml/cex" xmlns:w16cid="http://schemas.microsoft.com/office/word/2016/wordml/cid" xmlns:w16="http://schemas.microsoft.com/office/word/2018/wordml" xmlns:w16du="http://schemas.microsoft.com/office/word/2023/wordml/word16du" xmlns:w16sdtdh="http://schemas.microsoft.com/office/word/2020/wordml/sdtdatahash" xmlns:w16sdtfl="http://schemas.microsoft.com/office/word/2024/wordml/sdtformatlock" xmlns:w16se="http://schemas.microsoft.com/office/word/2015/wordml/symex" xmlns:wpg="http://schemas.microsoft.com/office/word/2010/wordprocessingGroup" xmlns:wpi="http://schemas.microsoft.com/office/word/2010/wordprocessingInk" xmlns:wne="http://schemas.microsoft.com/office/word/2006/wordml" xmlns:wps="http://schemas.microsoft.com/office/word/2010/wordprocessingShape" mc:Ignorable="w14 w15 w16se w16cid w16 w16cex w16sdtdh w16sdtfl w16du wp14">
   <w:abstractNum w:abstractNumId="0" w15:restartNumberingAfterBreak="0">
     <w:nsid w:val="03E17B05"/>
     <w:multiLevelType w:val="hybridMultilevel"/>
@@ -2324,62 +2309,62 @@
       </w:rPr>
     </w:lvl>
   </w:abstractNum>
-  <w:num w:numId="1">
+  <w:num w:numId="1" w16cid:durableId="9533317">
     <w:abstractNumId w:val="1"/>
   </w:num>
-  <w:num w:numId="2">
+  <w:num w:numId="2" w16cid:durableId="1002464531">
     <w:abstractNumId w:val="1"/>
   </w:num>
-  <w:num w:numId="3">
+  <w:num w:numId="3" w16cid:durableId="830100375">
     <w:abstractNumId w:val="1"/>
   </w:num>
-  <w:num w:numId="4">
+  <w:num w:numId="4" w16cid:durableId="1455758556">
     <w:abstractNumId w:val="7"/>
   </w:num>
-  <w:num w:numId="5">
+  <w:num w:numId="5" w16cid:durableId="198788093">
     <w:abstractNumId w:val="11"/>
   </w:num>
-  <w:num w:numId="6">
+  <w:num w:numId="6" w16cid:durableId="1428426385">
     <w:abstractNumId w:val="13"/>
   </w:num>
-  <w:num w:numId="7">
+  <w:num w:numId="7" w16cid:durableId="1141338153">
     <w:abstractNumId w:val="3"/>
   </w:num>
-  <w:num w:numId="8">
+  <w:num w:numId="8" w16cid:durableId="1730231242">
     <w:abstractNumId w:val="4"/>
   </w:num>
-  <w:num w:numId="9">
+  <w:num w:numId="9" w16cid:durableId="866605372">
     <w:abstractNumId w:val="12"/>
   </w:num>
-  <w:num w:numId="10">
+  <w:num w:numId="10" w16cid:durableId="713887880">
     <w:abstractNumId w:val="5"/>
   </w:num>
-  <w:num w:numId="11">
+  <w:num w:numId="11" w16cid:durableId="506166279">
     <w:abstractNumId w:val="8"/>
   </w:num>
-  <w:num w:numId="12">
+  <w:num w:numId="12" w16cid:durableId="519439420">
     <w:abstractNumId w:val="10"/>
   </w:num>
-  <w:num w:numId="13">
+  <w:num w:numId="13" w16cid:durableId="1690989055">
     <w:abstractNumId w:val="2"/>
   </w:num>
-  <w:num w:numId="14">
+  <w:num w:numId="14" w16cid:durableId="1318458175">
     <w:abstractNumId w:val="9"/>
   </w:num>
-  <w:num w:numId="15">
+  <w:num w:numId="15" w16cid:durableId="1968464304">
     <w:abstractNumId w:val="14"/>
   </w:num>
-  <w:num w:numId="16">
+  <w:num w:numId="16" w16cid:durableId="1613897253">
     <w:abstractNumId w:val="0"/>
   </w:num>
-  <w:num w:numId="17">
+  <w:num w:numId="17" w16cid:durableId="327025786">
     <w:abstractNumId w:val="6"/>
   </w:num>
 </w:numbering>
 </file>
 
 <file path=word/styles.xml><?xml version="1.0" encoding="utf-8"?>
-<w:styles xmlns:mc="http://schemas.openxmlformats.org/markup-compatibility/2006" xmlns:r="http://schemas.openxmlformats.org/officeDocument/2006/relationships" xmlns:w="http://schemas.openxmlformats.org/wordprocessingml/2006/main" xmlns:w14="http://schemas.microsoft.com/office/word/2010/wordml" xmlns:w15="http://schemas.microsoft.com/office/word/2012/wordml" xmlns:w16se="http://schemas.microsoft.com/office/word/2015/wordml/symex" mc:Ignorable="w14 w15 w16se">
+<w:styles xmlns:mc="http://schemas.openxmlformats.org/markup-compatibility/2006" xmlns:r="http://schemas.openxmlformats.org/officeDocument/2006/relationships" xmlns:w="http://schemas.openxmlformats.org/wordprocessingml/2006/main" xmlns:w14="http://schemas.microsoft.com/office/word/2010/wordml" xmlns:w15="http://schemas.microsoft.com/office/word/2012/wordml" xmlns:w16cex="http://schemas.microsoft.com/office/word/2018/wordml/cex" xmlns:w16cid="http://schemas.microsoft.com/office/word/2016/wordml/cid" xmlns:w16="http://schemas.microsoft.com/office/word/2018/wordml" xmlns:w16du="http://schemas.microsoft.com/office/word/2023/wordml/word16du" xmlns:w16sdtdh="http://schemas.microsoft.com/office/word/2020/wordml/sdtdatahash" xmlns:w16sdtfl="http://schemas.microsoft.com/office/word/2024/wordml/sdtformatlock" xmlns:w16se="http://schemas.microsoft.com/office/word/2015/wordml/symex" mc:Ignorable="w14 w15 w16se w16cid w16 w16cex w16sdtdh w16sdtfl w16du">
   <w:docDefaults>
     <w:rPrDefault>
       <w:rPr>
@@ -2395,7 +2380,7 @@
       </w:pPr>
     </w:pPrDefault>
   </w:docDefaults>
-  <w:latentStyles w:defLockedState="0" w:defUIPriority="99" w:defSemiHidden="0" w:defUnhideWhenUsed="0" w:defQFormat="0" w:count="371">
+  <w:latentStyles w:defLockedState="0" w:defUIPriority="99" w:defSemiHidden="0" w:defUnhideWhenUsed="0" w:defQFormat="0" w:count="376">
     <w:lsdException w:name="Normal" w:uiPriority="0" w:qFormat="1"/>
     <w:lsdException w:name="heading 1" w:uiPriority="9" w:qFormat="1"/>
     <w:lsdException w:name="heading 2" w:semiHidden="1" w:uiPriority="9" w:unhideWhenUsed="1" w:qFormat="1"/>
@@ -2767,6 +2752,11 @@
     <w:lsdException w:name="List Table 5 Dark Accent 6" w:uiPriority="50"/>
     <w:lsdException w:name="List Table 6 Colorful Accent 6" w:uiPriority="51"/>
     <w:lsdException w:name="List Table 7 Colorful Accent 6" w:uiPriority="52"/>
+    <w:lsdException w:name="Mention" w:semiHidden="1" w:unhideWhenUsed="1"/>
+    <w:lsdException w:name="Smart Hyperlink" w:semiHidden="1" w:unhideWhenUsed="1"/>
+    <w:lsdException w:name="Hashtag" w:semiHidden="1" w:unhideWhenUsed="1"/>
+    <w:lsdException w:name="Unresolved Mention" w:semiHidden="1" w:unhideWhenUsed="1"/>
+    <w:lsdException w:name="Smart Link" w:semiHidden="1" w:unhideWhenUsed="1"/>
   </w:latentStyles>
   <w:style w:type="paragraph" w:default="1" w:styleId="Normal">
     <w:name w:val="Normal"/>

</xml_diff>